<commit_message>
docs: D-98 and D-99 in the decision log, SRS v1.7 and PRD v1.6
Co-Authored-By: Claude Opus 5.5 <noreply@anthropic.com>
</commit_message>
<xml_diff>
--- a/docs/requirements/Brokely_Product_Requirements_Document_v1.6.docx
+++ b/docs/requirements/Brokely_Product_Requirements_Document_v1.6.docx
@@ -1251,7 +1251,7 @@
                 <w:sz w:val="19"/>
                 <w:szCs w:val="19"/>
               </w:rPr>
-              <w:t>Aligned with SRS v1.7 (D-28 to D-97, R-14), after building release 0.1. Notifications move into 0.1 (D-94). New in 0.1: left to spend today and the daily guide on Home (D-58, D-95), a heads-up when nice-to-haves take more than food (D-96), debts from before in quick start (D-41), suggestions that never set amounts (D-46), money tips (D-67), light and dark appearance (D-32), safe sign-in on any phone (D-73, D-83), privacy notice, terms and no Android Auto Backup (D-92, D-93, D-97). New PRD-24 to PRD-30 and journey J-09.</w:t>
+              <w:t>Aligned with SRS v1.7 (D-28 to D-97, R-14), after building release 0.1. Notifications move into 0.1 (D-94). New in 0.1: left to spend today and the daily guide on Home (D-58, D-95), a heads-up when nice-to-haves take more than food (D-96), debts from before in quick start (D-41), suggestions that never set amounts (D-46), money tips (D-67), light and dark appearance (D-32), safe sign-in on any phone (D-73, D-83), privacy notice, terms and no Android Auto Backup (D-92, D-93, D-97). New PRD-24 to PRD-30 and journey J-09. Same day: clearer today card and a red ring past the budget (D-98); the wallet check is removed from 0.1 (D-99, PRD-23 removed).</w:t>
             </w:r>
           </w:p>
         </w:tc>
@@ -2462,7 +2462,7 @@
                 <w:sz w:val="19"/>
                 <w:szCs w:val="19"/>
               </w:rPr>
-              <w:t>Welcome screen with Brokely; quick start as a short chat (with debts from before), guided and track-first planning; set-asides; bills with Mark paid; manual transactions with splits; money in; refunds and transfers; debts with write-off; wallet check; Home with left in plan, left to spend today and the daily guide; chart, daily average, honest forecast and pace; category heads-ups; “No spending today” check-in; local notifications (bill due, logging reminder, streak, pace, debt due); money tips; light and dark appearance; local-only mode; accounts; offline storage and sync; export and delete.</w:t>
+              <w:t>Welcome screen with Brokely; quick start as a short chat (with debts from before), guided and track-first planning; set-asides; bills with Mark paid; manual transactions with splits; money in; refunds and transfers; debts with write-off; Home with left in plan, left to spend today and the daily guide; chart, daily average, honest forecast and pace; category heads-ups; “No spending today” check-in; local notifications (bill due, logging reminder, streak, pace, debt due); money tips; light and dark appearance; local-only mode; accounts; offline storage and sync; export and delete.</w:t>
             </w:r>
           </w:p>
         </w:tc>
@@ -2488,7 +2488,7 @@
                 <w:sz w:val="19"/>
                 <w:szCs w:val="19"/>
               </w:rPr>
-              <w:t>SRS gate 0.1: all 0.1 requirements pass; AC-01 to AC-30, AC-39 to AC-41, AC-47 to AC-49 and AC-52 to AC-70 pass.</w:t>
+              <w:t>SRS gate 0.1: all 0.1 requirements pass; AC-01 to AC-30, AC-39 to AC-41, AC-47 to AC-49, AC-52 to AC-61 and AC-64 to AC-71 pass.</w:t>
             </w:r>
           </w:p>
         </w:tc>
@@ -4064,6 +4064,63 @@
                 <w:szCs w:val="19"/>
               </w:rPr>
               <w:t>Privacy notice and terms in English and Malay (D-92, D-93); notifications in 0.1, local only, with a Friendly or Cheeky evening tone (D-94); left to spend today (D-95); a heads-up when nice-to-haves take more than food (D-96); no Android Auto Backup (D-97).</w:t>
+            </w:r>
+          </w:p>
+        </w:tc>
+      </w:tr>
+      <w:tr>
+        <w:trPr>
+          <w:cantSplit/>
+        </w:trPr>
+        <w:tc>
+          <w:tcPr>
+            <w:tcW w:type="dxa" w:w="1606"/>
+            <w:tcBorders>
+              <w:top w:val="single" w:color="C8D3CA" w:sz="4"/>
+              <w:left w:val="single" w:color="C8D3CA" w:sz="4"/>
+              <w:bottom w:val="single" w:color="C8D3CA" w:sz="4"/>
+              <w:right w:val="single" w:color="C8D3CA" w:sz="4"/>
+            </w:tcBorders>
+            <w:tcMar>
+              <w:top w:type="dxa" w:w="60"/>
+              <w:left w:type="dxa" w:w="100"/>
+              <w:bottom w:type="dxa" w:w="60"/>
+              <w:right w:type="dxa" w:w="100"/>
+            </w:tcMar>
+          </w:tcPr>
+          <w:p>
+            <w:r>
+              <w:rPr>
+                <w:sz w:val="19"/>
+                <w:szCs w:val="19"/>
+              </w:rPr>
+              <w:t>D-98, D-99</w:t>
+            </w:r>
+          </w:p>
+        </w:tc>
+        <w:tc>
+          <w:tcPr>
+            <w:tcW w:type="dxa" w:w="8032"/>
+            <w:tcBorders>
+              <w:top w:val="single" w:color="C8D3CA" w:sz="4"/>
+              <w:left w:val="single" w:color="C8D3CA" w:sz="4"/>
+              <w:bottom w:val="single" w:color="C8D3CA" w:sz="4"/>
+              <w:right w:val="single" w:color="C8D3CA" w:sz="4"/>
+            </w:tcBorders>
+            <w:tcMar>
+              <w:top w:type="dxa" w:w="60"/>
+              <w:left w:type="dxa" w:w="100"/>
+              <w:bottom w:type="dxa" w:w="60"/>
+              <w:right w:type="dxa" w:w="100"/>
+            </w:tcMar>
+          </w:tcPr>
+          <w:p>
+            <w:r>
+              <w:rPr>
+                <w:sz w:val="19"/>
+                <w:szCs w:val="19"/>
+              </w:rPr>
+              <w:t>The today card leads with the amount a day from tomorrow once today is over, and the ring turns red past the budget (D-98). The wallet check is removed to keep 0.1 small (D-99).</w:t>
             </w:r>
           </w:p>
         </w:tc>
@@ -4187,7 +4244,7 @@
         <w:pStyle w:val="Heading2"/>
       </w:pPr>
       <w:r>
-        <w:t xml:space="preserve">J-08 Money in and wallet check (0.1)</w:t>
+        <w:t>J-08 Money in (0.1)</w:t>
       </w:r>
     </w:p>
     <w:p>
@@ -4195,7 +4252,7 @@
         <w:spacing w:after="120"/>
       </w:pPr>
       <w:r>
-        <w:t xml:space="preserve">Record RM300 from family via quick add → later tap Wallet check, type what you really have → “Based on your check on Monday you’d have about RM202; you said RM180, so RM22 is missing. Log it?” → log it or leave it.</w:t>
+        <w:t>Record RM300 from family via quick add → it shows in Records as money in, never as spending → if money in passes the budget, Brokely suggests adding the difference to the plan.</w:t>
       </w:r>
     </w:p>
     <w:p>
@@ -7506,7 +7563,7 @@
                 <w:sz w:val="19"/>
                 <w:szCs w:val="19"/>
               </w:rPr>
-              <w:t xml:space="preserve">Check what you really have against your records and catch forgotten spending.</w:t>
+              <w:t>(Removed 23 Oct, D-99) Check what you really have against your records.</w:t>
             </w:r>
           </w:p>
         </w:tc>
@@ -7532,7 +7589,7 @@
                 <w:sz w:val="19"/>
                 <w:szCs w:val="19"/>
               </w:rPr>
-              <w:t xml:space="preserve">0.1</w:t>
+              <w:t>Removed</w:t>
             </w:r>
           </w:p>
         </w:tc>
@@ -7558,7 +7615,7 @@
                 <w:sz w:val="19"/>
                 <w:szCs w:val="19"/>
               </w:rPr>
-              <w:t xml:space="preserve">FR-WAL-01 to 04</w:t>
+              <w:t>—</w:t>
             </w:r>
           </w:p>
         </w:tc>
@@ -7584,7 +7641,7 @@
                 <w:sz w:val="19"/>
                 <w:szCs w:val="19"/>
               </w:rPr>
-              <w:t xml:space="preserve">AC-62, 63</w:t>
+              <w:t>—</w:t>
             </w:r>
           </w:p>
         </w:tc>
@@ -7693,7 +7750,7 @@
                 <w:sz w:val="19"/>
                 <w:szCs w:val="19"/>
               </w:rPr>
-              <w:t>FR-INS-09, 10</w:t>
+              <w:t>FR-INS-09, 10, 12</w:t>
             </w:r>
           </w:p>
         </w:tc>
@@ -7719,7 +7776,7 @@
                 <w:sz w:val="19"/>
                 <w:szCs w:val="19"/>
               </w:rPr>
-              <w:t>AC-64</w:t>
+              <w:t>AC-64, 71</w:t>
             </w:r>
           </w:p>
         </w:tc>
@@ -8985,7 +9042,7 @@
                 <w:sz w:val="19"/>
                 <w:szCs w:val="19"/>
               </w:rPr>
-              <w:t>Left in plan with the ring of the budget used, left to spend today and the daily guide, forecast line, spending so far, still to come, quick add, “No spending today”, wallet check; essential cards after a quick start; mascot picture from 0.2.</w:t>
+              <w:t>Left in plan with the ring of the budget used, left to spend today and the daily guide, forecast line, spending so far, still to come, quick add, “No spending today”; essential cards after a quick start; mascot picture from 0.2.</w:t>
             </w:r>
           </w:p>
         </w:tc>
@@ -9270,7 +9327,7 @@
                 <w:sz w:val="19"/>
                 <w:szCs w:val="19"/>
               </w:rPr>
-              <w:t>Profile and backup, your plan (guided setup, set-asides, revisions), bills and subscriptions, debts, wallet check, appearance, money tips, notifications, privacy notice and terms, export and delete.</w:t>
+              <w:t>Profile and backup, your plan (guided setup, set-asides, revisions), bills and subscriptions, debts, appearance, money tips, notifications, privacy notice and terms, export and delete.</w:t>
             </w:r>
           </w:p>
         </w:tc>

</xml_diff>